<commit_message>
Github Docs: Docs updates
</commit_message>
<xml_diff>
--- a/docs/JetStock_Documentation.docx
+++ b/docs/JetStock_Documentation.docx
@@ -453,7 +453,21 @@
         <w:rPr>
           <w:color w:val="000000"/>
         </w:rPr>
-        <w:t>, users are able to:</w:t>
+        <w:t xml:space="preserve">, users </w:t>
+      </w:r>
+      <w:proofErr w:type="gramStart"/>
+      <w:r>
+        <w:rPr>
+          <w:color w:val="000000"/>
+        </w:rPr>
+        <w:t>are able to</w:t>
+      </w:r>
+      <w:proofErr w:type="gramEnd"/>
+      <w:r>
+        <w:rPr>
+          <w:color w:val="000000"/>
+        </w:rPr>
+        <w:t>:</w:t>
       </w:r>
     </w:p>
     <w:p>
@@ -1934,7 +1948,21 @@
         <w:rPr>
           <w:color w:val="000000"/>
         </w:rPr>
-        <w:t xml:space="preserve"> follows a client-server architecture. The frontend is built using React and communicates with the backend through Axios-based HTTP requests. The backend is developed with Node.js and Express using MVC architecture to separate routes, controllers, business logic, and database interaction. MySQL is used as the relational database to store products, categories, suppliers, inventory, and stock movement records.</w:t>
+        <w:t xml:space="preserve"> follows a client-server architecture. The </w:t>
+      </w:r>
+      <w:proofErr w:type="gramStart"/>
+      <w:r>
+        <w:rPr>
+          <w:color w:val="000000"/>
+        </w:rPr>
+        <w:t>frontend</w:t>
+      </w:r>
+      <w:proofErr w:type="gramEnd"/>
+      <w:r>
+        <w:rPr>
+          <w:color w:val="000000"/>
+        </w:rPr>
+        <w:t xml:space="preserve"> is built using React and communicates with the backend through Axios-based HTTP requests. The backend is developed with Node.js and Express using MVC architecture to separate routes, controllers, business logic, and database interaction. MySQL is used as the relational database to store products, categories, suppliers, inventory, and stock movement records.</w:t>
       </w:r>
     </w:p>
     <w:p>
@@ -3557,7 +3585,23 @@
                 <w:sz w:val="20"/>
                 <w:szCs w:val="20"/>
               </w:rPr>
-              <w:t>As a user, I want to edit product details so product information stays accurate.</w:t>
+              <w:t xml:space="preserve">As a user, I want to edit product </w:t>
+            </w:r>
+            <w:proofErr w:type="gramStart"/>
+            <w:r>
+              <w:rPr>
+                <w:sz w:val="20"/>
+                <w:szCs w:val="20"/>
+              </w:rPr>
+              <w:t>details</w:t>
+            </w:r>
+            <w:proofErr w:type="gramEnd"/>
+            <w:r>
+              <w:rPr>
+                <w:sz w:val="20"/>
+                <w:szCs w:val="20"/>
+              </w:rPr>
+              <w:t xml:space="preserve"> so product information stays accurate.</w:t>
             </w:r>
           </w:p>
         </w:tc>
@@ -4235,7 +4279,23 @@
                 <w:sz w:val="20"/>
                 <w:szCs w:val="20"/>
               </w:rPr>
-              <w:t>As a user, I want to adjust stock quantity so inventory levels stay correct.</w:t>
+              <w:t xml:space="preserve">As a user, I want to adjust stock </w:t>
+            </w:r>
+            <w:proofErr w:type="gramStart"/>
+            <w:r>
+              <w:rPr>
+                <w:sz w:val="20"/>
+                <w:szCs w:val="20"/>
+              </w:rPr>
+              <w:t>quantity</w:t>
+            </w:r>
+            <w:proofErr w:type="gramEnd"/>
+            <w:r>
+              <w:rPr>
+                <w:sz w:val="20"/>
+                <w:szCs w:val="20"/>
+              </w:rPr>
+              <w:t xml:space="preserve"> so inventory levels stay correct.</w:t>
             </w:r>
           </w:p>
         </w:tc>
@@ -4372,7 +4432,23 @@
                 <w:sz w:val="20"/>
                 <w:szCs w:val="20"/>
               </w:rPr>
-              <w:t>As a user, I want to identify low-stock products so I know what to restock.</w:t>
+              <w:t xml:space="preserve">As a user, I want to identify low-stock </w:t>
+            </w:r>
+            <w:proofErr w:type="gramStart"/>
+            <w:r>
+              <w:rPr>
+                <w:sz w:val="20"/>
+                <w:szCs w:val="20"/>
+              </w:rPr>
+              <w:t>products</w:t>
+            </w:r>
+            <w:proofErr w:type="gramEnd"/>
+            <w:r>
+              <w:rPr>
+                <w:sz w:val="20"/>
+                <w:szCs w:val="20"/>
+              </w:rPr>
+              <w:t xml:space="preserve"> so I know what to restock.</w:t>
             </w:r>
           </w:p>
         </w:tc>
@@ -4878,7 +4954,15 @@
         <w:spacing w:before="40" w:after="40"/>
       </w:pPr>
       <w:r>
-        <w:t>Registration &amp; Login — New users create an account, existing users log in with validation.</w:t>
+        <w:t xml:space="preserve">Registration &amp; Login — New users create an </w:t>
+      </w:r>
+      <w:proofErr w:type="gramStart"/>
+      <w:r>
+        <w:t>account,</w:t>
+      </w:r>
+      <w:proofErr w:type="gramEnd"/>
+      <w:r>
+        <w:t xml:space="preserve"> existing users log in with validation.</w:t>
       </w:r>
     </w:p>
     <w:p>
@@ -5158,7 +5242,15 @@
         <w:spacing w:before="40" w:after="40"/>
       </w:pPr>
       <w:r>
-        <w:t>Inventory page with Stock In and Stock Out actions</w:t>
+        <w:t xml:space="preserve">Inventory page with Stock </w:t>
+      </w:r>
+      <w:proofErr w:type="gramStart"/>
+      <w:r>
+        <w:t>In</w:t>
+      </w:r>
+      <w:proofErr w:type="gramEnd"/>
+      <w:r>
+        <w:t xml:space="preserve"> and Stock Out actions</w:t>
       </w:r>
     </w:p>
     <w:p>
@@ -6268,7 +6360,21 @@
         <w:rPr>
           <w:color w:val="000000"/>
         </w:rPr>
-        <w:t>MySQL was used as the relational database. The schema was designed to support the full inventory lifecycle, with foreign key relationships enforcing data integrity across tables. Key design decisions:</w:t>
+        <w:t xml:space="preserve">MySQL was used as </w:t>
+      </w:r>
+      <w:proofErr w:type="gramStart"/>
+      <w:r>
+        <w:rPr>
+          <w:color w:val="000000"/>
+        </w:rPr>
+        <w:t>the</w:t>
+      </w:r>
+      <w:proofErr w:type="gramEnd"/>
+      <w:r>
+        <w:rPr>
+          <w:color w:val="000000"/>
+        </w:rPr>
+        <w:t xml:space="preserve"> relational database. The schema was designed to support the full inventory lifecycle, with foreign key relationships enforcing data integrity across tables. Key design decisions:</w:t>
       </w:r>
     </w:p>
     <w:p>
@@ -7158,7 +7264,15 @@
         <w:spacing w:before="40" w:after="40"/>
       </w:pPr>
       <w:r>
-        <w:t xml:space="preserve">Balancing scope within the timeline — The project scope was clearly defined upfront, allowing the team to </w:t>
+        <w:t xml:space="preserve">Balancing </w:t>
+      </w:r>
+      <w:proofErr w:type="gramStart"/>
+      <w:r>
+        <w:t>scope</w:t>
+      </w:r>
+      <w:proofErr w:type="gramEnd"/>
+      <w:r>
+        <w:t xml:space="preserve"> within the timeline — The project scope was clearly defined upfront, allowing the team to </w:t>
       </w:r>
       <w:proofErr w:type="spellStart"/>
       <w:r>
@@ -7186,7 +7300,21 @@
         <w:rPr>
           <w:color w:val="000000"/>
         </w:rPr>
-        <w:t>The following enhancements are planned for future iterations:</w:t>
+        <w:t xml:space="preserve">The following </w:t>
+      </w:r>
+      <w:proofErr w:type="gramStart"/>
+      <w:r>
+        <w:rPr>
+          <w:color w:val="000000"/>
+        </w:rPr>
+        <w:t>enhancements</w:t>
+      </w:r>
+      <w:proofErr w:type="gramEnd"/>
+      <w:r>
+        <w:rPr>
+          <w:color w:val="000000"/>
+        </w:rPr>
+        <w:t xml:space="preserve"> are planned for future iterations:</w:t>
       </w:r>
     </w:p>
     <w:p>
@@ -9150,7 +9278,16 @@
         <w:sz w:val="18"/>
         <w:szCs w:val="18"/>
       </w:rPr>
-      <w:t xml:space="preserve"> — Capstone Project Documentation</w:t>
+      <w:t xml:space="preserve"> — Capstone Project </w:t>
+    </w:r>
+    <w:proofErr w:type="gramStart"/>
+    <w:r>
+      <w:rPr>
+        <w:color w:val="2E75B6"/>
+        <w:sz w:val="18"/>
+        <w:szCs w:val="18"/>
+      </w:rPr>
+      <w:t>Documentation</w:t>
     </w:r>
     <w:r>
       <w:rPr>
@@ -9158,7 +9295,16 @@
         <w:sz w:val="18"/>
         <w:szCs w:val="18"/>
       </w:rPr>
-      <w:t xml:space="preserve">  |  Capstone Project 2026</w:t>
+      <w:t xml:space="preserve">  |</w:t>
+    </w:r>
+    <w:proofErr w:type="gramEnd"/>
+    <w:r>
+      <w:rPr>
+        <w:color w:val="595959"/>
+        <w:sz w:val="18"/>
+        <w:szCs w:val="18"/>
+      </w:rPr>
+      <w:t xml:space="preserve">  Capstone Project 2026</w:t>
     </w:r>
   </w:p>
 </w:hdr>

</xml_diff>